<commit_message>
Switch to puppeteer-core + @sparticuz/chromium for Railway compatibility
</commit_message>
<xml_diff>
--- a/niche-pack-builder-reference.docx
+++ b/niche-pack-builder-reference.docx
@@ -13868,6 +13868,428 @@
         </w:rPr>
         <w:t xml:space="preserve">Test: Browse Workflows → Add → complete onboarding → open workspace → all tabs visible</w:t>
       </w:r>
+    </w:p>
+    <w:p>
+      <w:pPr>
+        <w:spacing w:after="240" w:before="480"/>
+      </w:pPr>
+      <w:r>
+        <w:rPr>
+          <w:rFonts w:ascii="Arial" w:cs="Arial" w:eastAsia="Arial" w:hAnsi="Arial"/>
+          <w:b/>
+          <w:bCs/>
+          <w:color w:val="E83D00"/>
+          <w:sz w:val="40"/>
+          <w:szCs w:val="40"/>
+        </w:rPr>
+        <w:t>Documents in a Niche</w:t>
+      </w:r>
+    </w:p>
+    <w:p>
+      <w:pPr>
+        <w:spacing w:after="160" w:before="0"/>
+      </w:pPr>
+      <w:r>
+        <w:rPr>
+          <w:rFonts w:ascii="Arial" w:cs="Arial" w:eastAsia="Arial" w:hAnsi="Arial"/>
+          <w:color w:val="444444"/>
+          <w:sz w:val="22"/>
+          <w:szCs w:val="22"/>
+        </w:rPr>
+        <w:t>Any niche can include a documents database. The workspace page automatically renders it using DocumentsView (a two-panel editor) whenever the active DB has dbId === “documents”. The editor has Edit and Preview tabs with full markdown rendering.</w:t>
+      </w:r>
+    </w:p>
+    <w:p>
+      <w:pPr>
+        <w:spacing w:after="120" w:before="360"/>
+      </w:pPr>
+      <w:r>
+        <w:rPr>
+          <w:rFonts w:ascii="Arial" w:cs="Arial" w:eastAsia="Arial" w:hAnsi="Arial"/>
+          <w:b/>
+          <w:bCs/>
+          <w:color w:val="E83D00"/>
+          <w:sz w:val="32"/>
+          <w:szCs w:val="32"/>
+        </w:rPr>
+        <w:t>Schema (niches/&lt;id&gt;/schema.json)</w:t>
+      </w:r>
+    </w:p>
+    <w:p>
+      <w:pPr>
+        <w:pStyle w:val="ListParagraph"/>
+        <w:numPr>
+          <w:ilvl w:val="0"/>
+          <w:numId w:val="2"/>
+        </w:numPr>
+        <w:spacing w:after="80" w:before="0"/>
+      </w:pPr>
+      <w:r>
+        <w:rPr>
+          <w:rFonts w:ascii="Arial" w:cs="Arial" w:eastAsia="Arial" w:hAnsi="Arial"/>
+          <w:color w:val="444444"/>
+          <w:sz w:val="22"/>
+          <w:szCs w:val="22"/>
+        </w:rPr>
+        <w:t>Add a DB with id “documents” to the databases array in schema.json</w:t>
+      </w:r>
+    </w:p>
+    <w:p>
+      <w:pPr>
+        <w:pStyle w:val="ListParagraph"/>
+        <w:numPr>
+          <w:ilvl w:val="0"/>
+          <w:numId w:val="2"/>
+        </w:numPr>
+        <w:spacing w:after="80" w:before="0"/>
+      </w:pPr>
+      <w:r>
+        <w:rPr>
+          <w:rFonts w:ascii="Arial" w:cs="Arial" w:eastAsia="Arial" w:hAnsi="Arial"/>
+          <w:color w:val="444444"/>
+          <w:sz w:val="22"/>
+          <w:szCs w:val="22"/>
+        </w:rPr>
+        <w:t xml:space="preserve">Required properties: Title (title), Type (select), Notes (rich_text), URL (rich_text), Project (rich_text), Date Added (date)</w:t>
+      </w:r>
+    </w:p>
+    <w:p>
+      <w:pPr>
+        <w:pStyle w:val="ListParagraph"/>
+        <w:numPr>
+          <w:ilvl w:val="0"/>
+          <w:numId w:val="2"/>
+        </w:numPr>
+        <w:spacing w:after="80" w:before="0"/>
+      </w:pPr>
+      <w:r>
+        <w:rPr>
+          <w:rFonts w:ascii="Arial" w:cs="Arial" w:eastAsia="Arial" w:hAnsi="Arial"/>
+          <w:color w:val="444444"/>
+          <w:sz w:val="22"/>
+          <w:szCs w:val="22"/>
+        </w:rPr>
+        <w:t>CRITICAL: The body/content field must be named “Notes” — DocumentsView looks for Body, Content, Draft, Notes (in that order). Using any other name means the editor always shows empty.</w:t>
+      </w:r>
+    </w:p>
+    <w:p>
+      <w:pPr>
+        <w:pStyle w:val="ListParagraph"/>
+        <w:numPr>
+          <w:ilvl w:val="0"/>
+          <w:numId w:val="2"/>
+        </w:numPr>
+        <w:spacing w:after="80" w:before="0"/>
+      </w:pPr>
+      <w:r>
+        <w:rPr>
+          <w:rFonts w:ascii="Arial" w:cs="Arial" w:eastAsia="Arial" w:hAnsi="Arial"/>
+          <w:color w:val="444444"/>
+          <w:sz w:val="22"/>
+          <w:szCs w:val="22"/>
+        </w:rPr>
+        <w:t xml:space="preserve">Type select options should be niche-specific (e.g. Link, Note, Brief, Spec, Contract, Reference, Other for a project niche)</w:t>
+      </w:r>
+    </w:p>
+    <w:p>
+      <w:pPr>
+        <w:spacing w:after="120" w:before="360"/>
+      </w:pPr>
+      <w:r>
+        <w:rPr>
+          <w:rFonts w:ascii="Arial" w:cs="Arial" w:eastAsia="Arial" w:hAnsi="Arial"/>
+          <w:b/>
+          <w:bCs/>
+          <w:color w:val="E83D00"/>
+          <w:sz w:val="32"/>
+          <w:szCs w:val="32"/>
+        </w:rPr>
+        <w:t>Niche Registry (niche-registry.ts)</w:t>
+      </w:r>
+    </w:p>
+    <w:p>
+      <w:pPr>
+        <w:pStyle w:val="ListParagraph"/>
+        <w:numPr>
+          <w:ilvl w:val="0"/>
+          <w:numId w:val="2"/>
+        </w:numPr>
+        <w:spacing w:after="80" w:before="0"/>
+      </w:pPr>
+      <w:r>
+        <w:rPr>
+          <w:rFonts w:ascii="Arial" w:cs="Arial" w:eastAsia="Arial" w:hAnsi="Arial"/>
+          <w:color w:val="444444"/>
+          <w:sz w:val="22"/>
+          <w:szCs w:val="22"/>
+        </w:rPr>
+        <w:t>No special registry entry needed — DocumentsView renders automatically for any DB with dbId === “documents”</w:t>
+      </w:r>
+    </w:p>
+    <w:p>
+      <w:pPr>
+        <w:pStyle w:val="ListParagraph"/>
+        <w:numPr>
+          <w:ilvl w:val="0"/>
+          <w:numId w:val="2"/>
+        </w:numPr>
+        <w:spacing w:after="80" w:before="0"/>
+      </w:pPr>
+      <w:r>
+        <w:rPr>
+          <w:rFonts w:ascii="Arial" w:cs="Arial" w:eastAsia="Arial" w:hAnsi="Arial"/>
+          <w:color w:val="444444"/>
+          <w:sz w:val="22"/>
+          <w:szCs w:val="22"/>
+        </w:rPr>
+        <w:t xml:space="preserve">Do NOT add hiddenDbIds: [“documents”] — this hides it from the sidebar. Leave it visible so the native DocumentsView renders when the user selects it</w:t>
+      </w:r>
+    </w:p>
+    <w:p>
+      <w:pPr>
+        <w:pStyle w:val="ListParagraph"/>
+        <w:numPr>
+          <w:ilvl w:val="0"/>
+          <w:numId w:val="2"/>
+        </w:numPr>
+        <w:spacing w:after="80" w:before="0"/>
+      </w:pPr>
+      <w:r>
+        <w:rPr>
+          <w:rFonts w:ascii="Arial" w:cs="Arial" w:eastAsia="Arial" w:hAnsi="Arial"/>
+          <w:color w:val="444444"/>
+          <w:sz w:val="22"/>
+          <w:szCs w:val="22"/>
+        </w:rPr>
+        <w:t>CRITICAL: Multiple niches can have a “documents” DB. Always use both nicheId AND dbId when finding a documents DB in shell code: databases.find(d =&gt; d.nicheId === “&lt;id&gt;” &amp;&amp; d.dbId === “documents”). Never use dbId alone or you may get the wrong niche’s DB.</w:t>
+      </w:r>
+    </w:p>
+    <w:p>
+      <w:pPr>
+        <w:spacing w:after="120" w:before="360"/>
+      </w:pPr>
+      <w:r>
+        <w:rPr>
+          <w:rFonts w:ascii="Arial" w:cs="Arial" w:eastAsia="Arial" w:hAnsi="Arial"/>
+          <w:b/>
+          <w:bCs/>
+          <w:color w:val="E83D00"/>
+          <w:sz w:val="32"/>
+          <w:szCs w:val="32"/>
+        </w:rPr>
+        <w:t>How Rows Are Saved</w:t>
+      </w:r>
+    </w:p>
+    <w:p>
+      <w:pPr>
+        <w:pStyle w:val="ListParagraph"/>
+        <w:numPr>
+          <w:ilvl w:val="0"/>
+          <w:numId w:val="2"/>
+        </w:numPr>
+        <w:spacing w:after="80" w:before="0"/>
+      </w:pPr>
+      <w:r>
+        <w:rPr>
+          <w:rFonts w:ascii="Arial" w:cs="Arial" w:eastAsia="Arial" w:hAnsi="Arial"/>
+          <w:color w:val="444444"/>
+          <w:sz w:val="22"/>
+          <w:szCs w:val="22"/>
+        </w:rPr>
+        <w:t xml:space="preserve">Create: POST /api/members/workspace with { databaseId, properties, propertyTypes }. Properties must include Title (title) and Notes (rich_text) at minimum.</w:t>
+      </w:r>
+    </w:p>
+    <w:p>
+      <w:pPr>
+        <w:pStyle w:val="ListParagraph"/>
+        <w:numPr>
+          <w:ilvl w:val="0"/>
+          <w:numId w:val="2"/>
+        </w:numPr>
+        <w:spacing w:after="80" w:before="0"/>
+      </w:pPr>
+      <w:r>
+        <w:rPr>
+          <w:rFonts w:ascii="Arial" w:cs="Arial" w:eastAsia="Arial" w:hAnsi="Arial"/>
+          <w:color w:val="444444"/>
+          <w:sz w:val="22"/>
+          <w:szCs w:val="22"/>
+        </w:rPr>
+        <w:t xml:space="preserve">Update: PATCH /api/members/workspace/[pageId] with { properties, propertyTypes }. Merges into existing JSONB — only send changed fields, or send all fields from the editor.</w:t>
+      </w:r>
+    </w:p>
+    <w:p>
+      <w:pPr>
+        <w:pStyle w:val="ListParagraph"/>
+        <w:numPr>
+          <w:ilvl w:val="0"/>
+          <w:numId w:val="2"/>
+        </w:numPr>
+        <w:spacing w:after="80" w:before="0"/>
+      </w:pPr>
+      <w:r>
+        <w:rPr>
+          <w:rFonts w:ascii="Arial" w:cs="Arial" w:eastAsia="Arial" w:hAnsi="Arial"/>
+          <w:color w:val="444444"/>
+          <w:sz w:val="22"/>
+          <w:szCs w:val="22"/>
+        </w:rPr>
+        <w:t xml:space="preserve">Research Assistant “Save to documents”: chat/page.tsx calls POST /api/members/workspace with { Title, Notes: summaryText, Type: “Note”, “Date Added” }. The databaseId is found via deployedDbs (from /api/members/databases, which uses schemaSnapshot).</w:t>
+      </w:r>
+    </w:p>
+    <w:p>
+      <w:pPr>
+        <w:pStyle w:val="ListParagraph"/>
+        <w:numPr>
+          <w:ilvl w:val="0"/>
+          <w:numId w:val="2"/>
+        </w:numPr>
+        <w:spacing w:after="80" w:before="0"/>
+      </w:pPr>
+      <w:r>
+        <w:rPr>
+          <w:rFonts w:ascii="Arial" w:cs="Arial" w:eastAsia="Arial" w:hAnsi="Arial"/>
+          <w:color w:val="444444"/>
+          <w:sz w:val="22"/>
+          <w:szCs w:val="22"/>
+        </w:rPr>
+        <w:t>Self-heal creates missing DBs on workspace load only if the niche’s schemaSnapshot already includes the DB definition. Always deploy (push to Railway) after adding a new DB to schema.json so the seed updates the schemaSnapshot.</w:t>
+      </w:r>
+    </w:p>
+    <w:p>
+      <w:pPr>
+        <w:spacing w:after="120" w:before="360"/>
+      </w:pPr>
+      <w:r>
+        <w:rPr>
+          <w:rFonts w:ascii="Arial" w:cs="Arial" w:eastAsia="Arial" w:hAnsi="Arial"/>
+          <w:b/>
+          <w:bCs/>
+          <w:color w:val="E83D00"/>
+          <w:sz w:val="32"/>
+          <w:szCs w:val="32"/>
+        </w:rPr>
+        <w:t>DocumentsView Component</w:t>
+      </w:r>
+    </w:p>
+    <w:p>
+      <w:pPr>
+        <w:pStyle w:val="ListParagraph"/>
+        <w:numPr>
+          <w:ilvl w:val="0"/>
+          <w:numId w:val="2"/>
+        </w:numPr>
+        <w:spacing w:after="80" w:before="0"/>
+      </w:pPr>
+      <w:r>
+        <w:rPr>
+          <w:rFonts w:ascii="Arial" w:cs="Arial" w:eastAsia="Arial" w:hAnsi="Arial"/>
+          <w:color w:val="444444"/>
+          <w:sz w:val="22"/>
+          <w:szCs w:val="22"/>
+        </w:rPr>
+        <w:t xml:space="preserve">Location: components/workspace/documents-view.tsx</w:t>
+      </w:r>
+    </w:p>
+    <w:p>
+      <w:pPr>
+        <w:pStyle w:val="ListParagraph"/>
+        <w:numPr>
+          <w:ilvl w:val="0"/>
+          <w:numId w:val="2"/>
+        </w:numPr>
+        <w:spacing w:after="80" w:before="0"/>
+      </w:pPr>
+      <w:r>
+        <w:rPr>
+          <w:rFonts w:ascii="Arial" w:cs="Arial" w:eastAsia="Arial" w:hAnsi="Arial"/>
+          <w:color w:val="444444"/>
+          <w:sz w:val="22"/>
+          <w:szCs w:val="22"/>
+        </w:rPr>
+        <w:t xml:space="preserve">Rendered in workspace/page.tsx when: backend === “app” &amp;&amp; activeDbDisplay.dbId === “documents”</w:t>
+      </w:r>
+    </w:p>
+    <w:p>
+      <w:pPr>
+        <w:pStyle w:val="ListParagraph"/>
+        <w:numPr>
+          <w:ilvl w:val="0"/>
+          <w:numId w:val="2"/>
+        </w:numPr>
+        <w:spacing w:after="80" w:before="0"/>
+      </w:pPr>
+      <w:r>
+        <w:rPr>
+          <w:rFonts w:ascii="Arial" w:cs="Arial" w:eastAsia="Arial" w:hAnsi="Arial"/>
+          <w:color w:val="444444"/>
+          <w:sz w:val="22"/>
+          <w:szCs w:val="22"/>
+        </w:rPr>
+        <w:t>Two panels: left = document list grouped by Type; right = editor with title input, Type selector, and body textarea</w:t>
+      </w:r>
+    </w:p>
+    <w:p>
+      <w:pPr>
+        <w:pStyle w:val="ListParagraph"/>
+        <w:numPr>
+          <w:ilvl w:val="0"/>
+          <w:numId w:val="2"/>
+        </w:numPr>
+        <w:spacing w:after="80" w:before="0"/>
+      </w:pPr>
+      <w:r>
+        <w:rPr>
+          <w:rFonts w:ascii="Arial" w:cs="Arial" w:eastAsia="Arial" w:hAnsi="Arial"/>
+          <w:color w:val="444444"/>
+          <w:sz w:val="22"/>
+          <w:szCs w:val="22"/>
+        </w:rPr>
+        <w:t xml:space="preserve">Body field detection order: Body → Content → Draft → Notes. First match in db.properties wins. Falls back to “Body” if none found.</w:t>
+      </w:r>
+    </w:p>
+    <w:p>
+      <w:pPr>
+        <w:pStyle w:val="ListParagraph"/>
+        <w:numPr>
+          <w:ilvl w:val="0"/>
+          <w:numId w:val="2"/>
+        </w:numPr>
+        <w:spacing w:after="80" w:before="0"/>
+      </w:pPr>
+      <w:r>
+        <w:rPr>
+          <w:rFonts w:ascii="Arial" w:cs="Arial" w:eastAsia="Arial" w:hAnsi="Arial"/>
+          <w:color w:val="444444"/>
+          <w:sz w:val="22"/>
+          <w:szCs w:val="22"/>
+        </w:rPr>
+        <w:t xml:space="preserve">Editor has Edit / Preview tabs. Preview renders markdown (headings, bullets, bold, italic, code, blockquotes). Word count shown in toolbar.</w:t>
+      </w:r>
+    </w:p>
+    <w:p>
+      <w:pPr>
+        <w:pStyle w:val="ListParagraph"/>
+        <w:numPr>
+          <w:ilvl w:val="0"/>
+          <w:numId w:val="2"/>
+        </w:numPr>
+        <w:spacing w:after="80" w:before="0"/>
+      </w:pPr>
+      <w:r>
+        <w:rPr>
+          <w:rFonts w:ascii="Arial" w:cs="Arial" w:eastAsia="Arial" w:hAnsi="Arial"/>
+          <w:color w:val="444444"/>
+          <w:sz w:val="22"/>
+          <w:szCs w:val="22"/>
+        </w:rPr>
+        <w:t>Type options are read from db.properties (the niche’s schema), not hardcoded. The grouped list on the left uses TYPE_CONFIG for styling — add niche-specific types to TYPE_CONFIG if needed.</w:t>
+      </w:r>
+    </w:p>
+    <w:p>
+      <w:pPr>
+        <w:spacing w:after="120" w:before="0"/>
+      </w:pPr>
     </w:p>
     <w:sectPr>
       <w:pgSz w:w="12240" w:h="15840" w:orient="portrait"/>

</xml_diff>